<commit_message>
Fix broken Greek/special symbols in table headers
Root cause: Rscript defaults to LC_ALL=C (ASCII locale), causing UTF-8
multi-byte chars (α β γ ρ ± ≥) to be mangled when flextable serializes
headers to HTML via XML.

Fixes:
- Add .Rprofile to project root: sets LC_ALL=en_US.UTF-8 before any
  source() call, so script files are parsed as UTF-8
- Always invoke Rscript with LANG/LC_ALL=en_US.UTF-8
- All special-char headers now use flextable::compose + as_paragraph
  (make_bench_ft, make_combined_ft, make_illumina_ranks_ft)
- Regenerate all tables and figures

Co-Authored-By: Claude Sonnet 4.6 <noreply@anthropic.com>
</commit_message>
<xml_diff>
--- a/figs_tables/PHAUS_benchmark_combined.docx
+++ b/figs_tables/PHAUS_benchmark_combined.docx
@@ -36,19 +36,19 @@
         <w:gridCol w:w="2160"/>
         <w:gridCol w:w="1531"/>
         <w:gridCol w:w="1449"/>
-        <w:gridCol w:w="2161"/>
+        <w:gridCol w:w="1171"/>
         <w:gridCol w:w="1051"/>
         <w:gridCol w:w="1343"/>
-        <w:gridCol w:w="1649"/>
-        <w:gridCol w:w="2481"/>
-        <w:gridCol w:w="1649"/>
-        <w:gridCol w:w="2647"/>
-        <w:gridCol w:w="1649"/>
-        <w:gridCol w:w="1649"/>
+        <w:gridCol w:w="1071"/>
+        <w:gridCol w:w="1682"/>
+        <w:gridCol w:w="1467"/>
+        <w:gridCol w:w="1807"/>
+        <w:gridCol w:w="1463"/>
+        <w:gridCol w:w="1475"/>
       </w:tblGrid>
       <w:tr>
         <w:trPr>
-          <w:trHeight w:val="937" w:hRule="auto"/>
+          <w:trHeight w:val="893" w:hRule="auto"/>
           <w:tblHeader/>
         </w:trPr>
         <w:tc>
@@ -562,7 +562,7 @@
                 <w:szCs w:val="20"/>
                 <w:color w:val="FFFFFF"/>
               </w:rPr>
-              <w:t xml:space="preserve">(&lt;ce&gt;&lt;b1&gt;)</w:t>
+              <w:t xml:space="preserve">(α)</w:t>
             </w:r>
           </w:p>
         </w:tc>
@@ -630,7 +630,7 @@
                 <w:szCs w:val="20"/>
                 <w:color w:val="FFFFFF"/>
               </w:rPr>
-              <w:t xml:space="preserve">&lt;cf&gt;&lt;81&gt;</w:t>
+              <w:t xml:space="preserve">ρ</w:t>
             </w:r>
             <w:r>
               <w:rPr>
@@ -656,7 +656,7 @@
                 <w:szCs w:val="20"/>
                 <w:color w:val="FFFFFF"/>
               </w:rPr>
-              <w:t xml:space="preserve">(&lt;ce&gt;&lt;b1&gt;)</w:t>
+              <w:t xml:space="preserve">(α)</w:t>
             </w:r>
           </w:p>
         </w:tc>
@@ -750,7 +750,7 @@
                 <w:szCs w:val="20"/>
                 <w:color w:val="FFFFFF"/>
               </w:rPr>
-              <w:t xml:space="preserve">(&lt;ce&gt;&lt;b2&gt;)</w:t>
+              <w:t xml:space="preserve">(β)</w:t>
             </w:r>
           </w:p>
         </w:tc>
@@ -805,7 +805,7 @@
                 <w:szCs w:val="20"/>
                 <w:color w:val="FFFFFF"/>
               </w:rPr>
-              <w:t xml:space="preserve">BC Dist &lt;c2&gt;&lt;b1&gt; SD</w:t>
+              <w:t xml:space="preserve">BC Dist ± SD</w:t>
             </w:r>
             <w:r>
               <w:rPr>
@@ -831,7 +831,7 @@
                 <w:szCs w:val="20"/>
                 <w:color w:val="FFFFFF"/>
               </w:rPr>
-              <w:t xml:space="preserve">(&lt;ce&gt;&lt;b2&gt;)</w:t>
+              <w:t xml:space="preserve">(β)</w:t>
             </w:r>
           </w:p>
         </w:tc>
@@ -912,7 +912,7 @@
                 <w:szCs w:val="20"/>
                 <w:color w:val="FFFFFF"/>
               </w:rPr>
-              <w:t xml:space="preserve">(&lt;ce&gt;&lt;b3&gt;)</w:t>
+              <w:t xml:space="preserve">(γ)</w:t>
             </w:r>
           </w:p>
         </w:tc>
@@ -993,7 +993,7 @@
                 <w:szCs w:val="20"/>
                 <w:color w:val="FFFFFF"/>
               </w:rPr>
-              <w:t xml:space="preserve">(&lt;ce&gt;&lt;b3&gt;)</w:t>
+              <w:t xml:space="preserve">(γ)</w:t>
             </w:r>
           </w:p>
         </w:tc>
@@ -1549,7 +1549,7 @@
                 <w:szCs w:val="20"/>
                 <w:color w:val="000000"/>
               </w:rPr>
-              <w:t xml:space="preserve">0.358 &lt;c2&gt;&lt;b1&gt; 0.133</w:t>
+              <w:t xml:space="preserve">0.358 ± 0.133</w:t>
             </w:r>
           </w:p>
         </w:tc>
@@ -2202,7 +2202,7 @@
                 <w:szCs w:val="20"/>
                 <w:color w:val="000000"/>
               </w:rPr>
-              <w:t xml:space="preserve">0.4 &lt;c2&gt;&lt;b1&gt; 0.105</w:t>
+              <w:t xml:space="preserve">0.4 ± 0.105</w:t>
             </w:r>
           </w:p>
         </w:tc>
@@ -2855,7 +2855,7 @@
                 <w:szCs w:val="20"/>
                 <w:color w:val="000000"/>
               </w:rPr>
-              <w:t xml:space="preserve">0.571 &lt;c2&gt;&lt;b1&gt; 0.1</w:t>
+              <w:t xml:space="preserve">0.571 ± 0.1</w:t>
             </w:r>
           </w:p>
         </w:tc>
@@ -3508,7 +3508,7 @@
                 <w:szCs w:val="20"/>
                 <w:color w:val="000000"/>
               </w:rPr>
-              <w:t xml:space="preserve">0.601 &lt;c2&gt;&lt;b1&gt; 0.135</w:t>
+              <w:t xml:space="preserve">0.601 ± 0.135</w:t>
             </w:r>
           </w:p>
         </w:tc>
@@ -3705,7 +3705,7 @@
                 <w:szCs w:val="22"/>
                 <w:color w:val="000000"/>
               </w:rPr>
-              <w:t xml:space="preserve">(&lt;e2&gt;&lt;89&gt;&lt;a5&gt; 0.0001% of sample reads)</w:t>
+              <w:t xml:space="preserve">(≥ 0.0001% of sample reads)</w:t>
             </w:r>
           </w:p>
         </w:tc>
@@ -3870,7 +3870,7 @@
                 <w:szCs w:val="20"/>
                 <w:color w:val="000000"/>
               </w:rPr>
-              <w:t xml:space="preserve">&lt;e2&gt;&lt;89&gt;&lt;a5&gt;4</w:t>
+              <w:t xml:space="preserve">≥4</w:t>
             </w:r>
           </w:p>
         </w:tc>
@@ -4200,7 +4200,7 @@
                 <w:szCs w:val="20"/>
                 <w:color w:val="000000"/>
               </w:rPr>
-              <w:t xml:space="preserve">0.285 &lt;c2&gt;&lt;b1&gt; 0.118</w:t>
+              <w:t xml:space="preserve">0.285 ± 0.118</w:t>
             </w:r>
           </w:p>
         </w:tc>
@@ -4523,7 +4523,7 @@
                 <w:szCs w:val="20"/>
                 <w:color w:val="000000"/>
               </w:rPr>
-              <w:t xml:space="preserve">&lt;e2&gt;&lt;89&gt;&lt;a5&gt;3</w:t>
+              <w:t xml:space="preserve">≥3</w:t>
             </w:r>
           </w:p>
         </w:tc>
@@ -4853,7 +4853,7 @@
                 <w:szCs w:val="20"/>
                 <w:color w:val="000000"/>
               </w:rPr>
-              <w:t xml:space="preserve">0.362 &lt;c2&gt;&lt;b1&gt; 0.107</w:t>
+              <w:t xml:space="preserve">0.362 ± 0.107</w:t>
             </w:r>
           </w:p>
         </w:tc>
@@ -5176,7 +5176,7 @@
                 <w:szCs w:val="20"/>
                 <w:color w:val="000000"/>
               </w:rPr>
-              <w:t xml:space="preserve">&lt;e2&gt;&lt;89&gt;&lt;a5&gt;3</w:t>
+              <w:t xml:space="preserve">≥3</w:t>
             </w:r>
           </w:p>
         </w:tc>
@@ -5506,7 +5506,7 @@
                 <w:szCs w:val="20"/>
                 <w:color w:val="000000"/>
               </w:rPr>
-              <w:t xml:space="preserve">0.486 &lt;c2&gt;&lt;b1&gt; 0.091</w:t>
+              <w:t xml:space="preserve">0.486 ± 0.091</w:t>
             </w:r>
           </w:p>
         </w:tc>
@@ -5829,7 +5829,7 @@
                 <w:szCs w:val="20"/>
                 <w:color w:val="000000"/>
               </w:rPr>
-              <w:t xml:space="preserve">&lt;e2&gt;&lt;89&gt;&lt;a5&gt;5</w:t>
+              <w:t xml:space="preserve">≥5</w:t>
             </w:r>
           </w:p>
         </w:tc>
@@ -6159,7 +6159,7 @@
                 <w:szCs w:val="20"/>
                 <w:color w:val="000000"/>
               </w:rPr>
-              <w:t xml:space="preserve">0.441 &lt;c2&gt;&lt;b1&gt; 0.13</w:t>
+              <w:t xml:space="preserve">0.441 ± 0.13</w:t>
             </w:r>
           </w:p>
         </w:tc>
@@ -6356,7 +6356,7 @@
                 <w:szCs w:val="22"/>
                 <w:color w:val="000000"/>
               </w:rPr>
-              <w:t xml:space="preserve">(&lt;e2&gt;&lt;89&gt;&lt;a5&gt; 0.001% of sample reads)</w:t>
+              <w:t xml:space="preserve">(≥ 0.001% of sample reads)</w:t>
             </w:r>
           </w:p>
         </w:tc>
@@ -6521,7 +6521,7 @@
                 <w:szCs w:val="20"/>
                 <w:color w:val="000000"/>
               </w:rPr>
-              <w:t xml:space="preserve">&lt;e2&gt;&lt;89&gt;&lt;a5&gt;32</w:t>
+              <w:t xml:space="preserve">≥32</w:t>
             </w:r>
           </w:p>
         </w:tc>
@@ -6851,7 +6851,7 @@
                 <w:szCs w:val="20"/>
                 <w:color w:val="000000"/>
               </w:rPr>
-              <w:t xml:space="preserve">0.302 &lt;c2&gt;&lt;b1&gt; 0.096</w:t>
+              <w:t xml:space="preserve">0.302 ± 0.096</w:t>
             </w:r>
           </w:p>
         </w:tc>
@@ -7174,7 +7174,7 @@
                 <w:szCs w:val="20"/>
                 <w:color w:val="000000"/>
               </w:rPr>
-              <w:t xml:space="preserve">&lt;e2&gt;&lt;89&gt;&lt;a5&gt;29</w:t>
+              <w:t xml:space="preserve">≥29</w:t>
             </w:r>
           </w:p>
         </w:tc>
@@ -7504,7 +7504,7 @@
                 <w:szCs w:val="20"/>
                 <w:color w:val="000000"/>
               </w:rPr>
-              <w:t xml:space="preserve">0.35 &lt;c2&gt;&lt;b1&gt; 0.093</w:t>
+              <w:t xml:space="preserve">0.35 ± 0.093</w:t>
             </w:r>
           </w:p>
         </w:tc>
@@ -7827,7 +7827,7 @@
                 <w:szCs w:val="20"/>
                 <w:color w:val="000000"/>
               </w:rPr>
-              <w:t xml:space="preserve">&lt;e2&gt;&lt;89&gt;&lt;a5&gt;23</w:t>
+              <w:t xml:space="preserve">≥23</w:t>
             </w:r>
           </w:p>
         </w:tc>
@@ -8157,7 +8157,7 @@
                 <w:szCs w:val="20"/>
                 <w:color w:val="000000"/>
               </w:rPr>
-              <w:t xml:space="preserve">0.456 &lt;c2&gt;&lt;b1&gt; 0.076</w:t>
+              <w:t xml:space="preserve">0.456 ± 0.076</w:t>
             </w:r>
           </w:p>
         </w:tc>
@@ -8480,7 +8480,7 @@
                 <w:szCs w:val="20"/>
                 <w:color w:val="000000"/>
               </w:rPr>
-              <w:t xml:space="preserve">&lt;e2&gt;&lt;89&gt;&lt;a5&gt;45</w:t>
+              <w:t xml:space="preserve">≥45</w:t>
             </w:r>
           </w:p>
         </w:tc>
@@ -8810,7 +8810,7 @@
                 <w:szCs w:val="20"/>
                 <w:color w:val="000000"/>
               </w:rPr>
-              <w:t xml:space="preserve">0.337 &lt;c2&gt;&lt;b1&gt; 0.099</w:t>
+              <w:t xml:space="preserve">0.337 ± 0.099</w:t>
             </w:r>
           </w:p>
         </w:tc>

</xml_diff>